<commit_message>
update class 2 and 3
</commit_message>
<xml_diff>
--- a/Intro_to_R_class_2/Introduction_to_R_class_2.docx
+++ b/Intro_to_R_class_2/Introduction_to_R_class_2.docx
@@ -40,7 +40,7 @@
         <w:pStyle w:val="Date"/>
       </w:pPr>
       <w:r>
-        <w:t xml:space="preserve">2025-09-25</w:t>
+        <w:t xml:space="preserve">2025-09-26</w:t>
       </w:r>
     </w:p>
     <w:p>
@@ -114,7 +114,7 @@
           <w:b/>
           <w:bCs/>
         </w:rPr>
-        <w:t xml:space="preserve">RStudio has three great advantages over classical R console:</w:t>
+        <w:t xml:space="preserve">RStudio has three great advantages over the classical R console:</w:t>
       </w:r>
     </w:p>
     <w:p>
@@ -226,7 +226,7 @@
         <w:t xml:space="preserve"> </w:t>
       </w:r>
       <w:r>
-        <w:t xml:space="preserve">- Here you can write your code and save it in a text file (.R). You can run it anytime by highlighting given piece of code and clicking</w:t>
+        <w:t xml:space="preserve">- Here you can write your code and save it in a text file (.R). You can run it anytime by highlighting the given piece of code and clicking</w:t>
       </w:r>
       <w:r>
         <w:t xml:space="preserve"> </w:t>
@@ -241,7 +241,7 @@
         <w:t xml:space="preserve"> </w:t>
       </w:r>
       <w:r>
-        <w:t xml:space="preserve">in right-top corner (also Ctrl + Enter).</w:t>
+        <w:t xml:space="preserve">in the top-right corner (also Ctrl + Enter).</w:t>
       </w:r>
     </w:p>
     <w:p>
@@ -262,7 +262,7 @@
         <w:t xml:space="preserve"> </w:t>
       </w:r>
       <w:r>
-        <w:t xml:space="preserve">- Exactly the same console as in standard R (see Class 1). Note that any line of code run from the Code editor will appear in the console. To recall the lastly run line of code, use</w:t>
+        <w:t xml:space="preserve">- The same console as in standard R (see Class 1). Note that any line of code run from the Code editor will appear in the console. To recall the last run line of code, use</w:t>
       </w:r>
       <w:r>
         <w:t xml:space="preserve"> </w:t>
@@ -682,7 +682,7 @@
           <w:b/>
           <w:bCs/>
         </w:rPr>
-        <w:t xml:space="preserve">Create new script file and save it. Call it as you wish. Write code for all subsequent exercises using Code editor. Remember that to obtain any outcome/result you need to run your code first.</w:t>
+        <w:t xml:space="preserve">Create a new script file and save it. Call it as you wish. Write code for all subsequent exercises using the Code editor. Remember that to obtain any outcome/result, you need to run your code first.</w:t>
       </w:r>
     </w:p>
     <w:p>
@@ -690,7 +690,7 @@
         <w:pStyle w:val="BodyText"/>
       </w:pPr>
       <w:r>
-        <w:t xml:space="preserve">To make your code easier to read and understand it is a good practice to</w:t>
+        <w:t xml:space="preserve">To make your code easier to read and understand, it is a good practice to</w:t>
       </w:r>
       <w:r>
         <w:t xml:space="preserve"> </w:t>
@@ -703,7 +703,7 @@
         <w:t xml:space="preserve">add comments</w:t>
       </w:r>
       <w:r>
-        <w:t xml:space="preserve">. Comments help explain what specific sections of the code are doing. This may be useful for other people using your script, and for you as even if you know what your code is doing, after some time you may forget it, and again spend a lot of time to understand its functioning.</w:t>
+        <w:t xml:space="preserve">. Comments help explain what specific sections of the code are doing. This may be useful for other people using your script, and for you as well. Even if you know what your code is doing, after some time, you may forget it, and you may have to spend a lot of time understanding its functionality again.</w:t>
       </w:r>
     </w:p>
     <w:p>
@@ -721,7 +721,7 @@
           <w:b/>
           <w:bCs/>
         </w:rPr>
-        <w:t xml:space="preserve">starting the line with hashtag</w:t>
+        <w:t xml:space="preserve">starting the line with the hashtag</w:t>
       </w:r>
       <w:r>
         <w:t xml:space="preserve"> </w:t>
@@ -733,7 +733,7 @@
         <w:t xml:space="preserve">#</w:t>
       </w:r>
       <w:r>
-        <w:t xml:space="preserve">. Apart from adding comments to your script hashtag can be also used to</w:t>
+        <w:t xml:space="preserve">. Apart from adding comments to your script hashtag can also be used to</w:t>
       </w:r>
       <w:r>
         <w:t xml:space="preserve"> </w:t>
@@ -786,10 +786,7 @@
         <w:t xml:space="preserve">comment several lines</w:t>
       </w:r>
       <w:r>
-        <w:t xml:space="preserve"> </w:t>
-      </w:r>
-      <w:r>
-        <w:t xml:space="preserve">highlight them and use</w:t>
+        <w:t xml:space="preserve">, highlight them and use</w:t>
       </w:r>
       <w:r>
         <w:t xml:space="preserve"> </w:t>
@@ -802,7 +799,7 @@
         <w:t xml:space="preserve">Ctrl+Shift+c</w:t>
       </w:r>
       <w:r>
-        <w:t xml:space="preserve">. Repeat it to uncomment. When you remove hashtag, the command will be executed when you run your script again.</w:t>
+        <w:t xml:space="preserve">. Repeat it to uncomment. When you remove the hashtag, the command will be executed when you run your script again.</w:t>
       </w:r>
     </w:p>
     <w:p>
@@ -872,7 +869,7 @@
           <w:b/>
           <w:bCs/>
         </w:rPr>
-        <w:t xml:space="preserve">Working directory</w:t>
+        <w:t xml:space="preserve">The working directory</w:t>
       </w:r>
       <w:r>
         <w:t xml:space="preserve"> </w:t>
@@ -891,7 +888,7 @@
         <w:t xml:space="preserve">R is operating at the moment</w:t>
       </w:r>
       <w:r>
-        <w:t xml:space="preserve">. Think about it as a separate room for a given analysis. R will look for and save all files in the working directory by default. You can check current working directory by typing</w:t>
+        <w:t xml:space="preserve">. Think about it as a separate room for a given analysis. R will look for and save all files in the working directory by default. You can check the current working directory by typing</w:t>
       </w:r>
       <w:r>
         <w:t xml:space="preserve"> </w:t>
@@ -911,7 +908,7 @@
         <w:pStyle w:val="BodyText"/>
       </w:pPr>
       <w:r>
-        <w:t xml:space="preserve">To set new working directory use Session → Set Working Directory → Choose Directory or use</w:t>
+        <w:t xml:space="preserve">To set a new working directory, choose Session → Set Working Directory → Choose Directory, or use the</w:t>
       </w:r>
       <w:r>
         <w:t xml:space="preserve"> </w:t>
@@ -926,23 +923,17 @@
         <w:t xml:space="preserve"> </w:t>
       </w:r>
       <w:r>
-        <w:t xml:space="preserve">function with a destination path provided as an argument.</w:t>
-      </w:r>
-      <w:r>
-        <w:t xml:space="preserve"> </w:t>
-      </w:r>
-      <w:r>
-        <w:t xml:space="preserve">Unless you continue a previous analysis,</w:t>
-      </w:r>
-      <w:r>
-        <w:t xml:space="preserve"> </w:t>
-      </w:r>
-      <w:r>
-        <w:rPr>
-          <w:b/>
-          <w:bCs/>
-        </w:rPr>
-        <w:t xml:space="preserve">always set new working directory</w:t>
+        <w:t xml:space="preserve">function with a destination path provided as an argument. Unless you continue a previous analysis,</w:t>
+      </w:r>
+      <w:r>
+        <w:t xml:space="preserve"> </w:t>
+      </w:r>
+      <w:r>
+        <w:rPr>
+          <w:b/>
+          <w:bCs/>
+        </w:rPr>
+        <w:t xml:space="preserve">always set a new working directory</w:t>
       </w:r>
       <w:r>
         <w:t xml:space="preserve">.</w:t>
@@ -984,7 +975,7 @@
         <w:t xml:space="preserve"> </w:t>
       </w:r>
       <w:r>
-        <w:t xml:space="preserve">panel will not update automatically. To display files from your working directory use</w:t>
+        <w:t xml:space="preserve">panel will not update automatically. To display files from your working directory, use the</w:t>
       </w:r>
       <w:r>
         <w:t xml:space="preserve"> </w:t>
@@ -1086,7 +1077,7 @@
         <w:br/>
       </w:r>
       <w:r>
-        <w:t xml:space="preserve">Although it is usually easier to create folders traditionally, using your operating system, have in mind that you can also do it through R by using</w:t>
+        <w:t xml:space="preserve">Although it is usually easier to create folders traditionally, using your operating system, keep in mind that you can also do it through R by using</w:t>
       </w:r>
       <w:r>
         <w:t xml:space="preserve"> </w:t>
@@ -1158,7 +1149,7 @@
           <w:b/>
           <w:bCs/>
         </w:rPr>
-        <w:t xml:space="preserve">programming workflow</w:t>
+        <w:t xml:space="preserve">the programming workflow</w:t>
       </w:r>
       <w:r>
         <w:t xml:space="preserve">.</w:t>
@@ -1307,7 +1298,7 @@
         <w:t xml:space="preserve"> </w:t>
       </w:r>
       <w:r>
-        <w:t xml:space="preserve">– this is important especially when</w:t>
+        <w:t xml:space="preserve">– this is important, especially when</w:t>
       </w:r>
       <w:r>
         <w:t xml:space="preserve"> </w:t>
@@ -1412,7 +1403,7 @@
         <w:t xml:space="preserve">through the user interface</w:t>
       </w:r>
       <w:r>
-        <w:t xml:space="preserve">. Which one you pick, depends on you.</w:t>
+        <w:t xml:space="preserve">. Which one you pick depends on you.</w:t>
       </w:r>
       <w:r>
         <w:t xml:space="preserve"> </w:t>
@@ -1434,7 +1425,7 @@
         <w:t xml:space="preserve"> </w:t>
       </w:r>
       <w:r>
-        <w:t xml:space="preserve">through the user interface, go to the files section of the screen (lower right square section). Then pick the files tab.</w:t>
+        <w:t xml:space="preserve">through the user interface, go to the files section of the screen (lower right square section). Then, pick the files tab.</w:t>
       </w:r>
     </w:p>
     <w:p>
@@ -1502,7 +1493,7 @@
         <w:t xml:space="preserve">by default, the tab will display the content of your working directory</w:t>
       </w:r>
       <w:r>
-        <w:t xml:space="preserve">. You can pick a file that is not in your working directory, however, it is good practice to keep a copy of the files you’re working on in the folder set as your working directory.</w:t>
+        <w:t xml:space="preserve">. You can pick a file that is not in your working directory; however, it is good practice to keep a copy of the files you’re working on in the folder set as your working directory.</w:t>
       </w:r>
     </w:p>
     <w:p>
@@ -1525,7 +1516,7 @@
         <w:t xml:space="preserve">import dataset</w:t>
       </w:r>
       <w:r>
-        <w:t xml:space="preserve">, and navigate through the upload process. Through the upload menu, you can setup the name of the file, the sheet in the excel file you want to upload, and the range of data you want to include. R also generates code that you can then copy and include into your R script.</w:t>
+        <w:t xml:space="preserve">, and navigate through the upload process. Through the upload menu, you can set up the name of the file, the sheet in the Excel file you want to upload, and the range of data you want to include. R also generates code that you can then copy and include in your R script.</w:t>
       </w:r>
     </w:p>
     <w:p>
@@ -1615,7 +1606,7 @@
           <w:b/>
           <w:bCs/>
         </w:rPr>
-        <w:t xml:space="preserve">Download</w:t>
+        <w:t xml:space="preserve">Download the</w:t>
       </w:r>
       <w:r>
         <w:rPr>
@@ -1646,7 +1637,7 @@
           <w:b/>
           <w:bCs/>
         </w:rPr>
-        <w:t xml:space="preserve">file and save it in your working directory. Then, uplod the file into R using RStudio user interface.</w:t>
+        <w:t xml:space="preserve">file and save it in your working directory. Then, upload the file into R using theRStudio user interface.</w:t>
       </w:r>
     </w:p>
     <w:p>
@@ -1682,7 +1673,7 @@
         <w:t xml:space="preserve"> </w:t>
       </w:r>
       <w:r>
-        <w:t xml:space="preserve">– we need an external package</w:t>
+        <w:t xml:space="preserve">– we need an external package,</w:t>
       </w:r>
       <w:r>
         <w:t xml:space="preserve"> </w:t>
@@ -1726,7 +1717,7 @@
         <w:t xml:space="preserve">collection of functions not available in the base R</w:t>
       </w:r>
       <w:r>
-        <w:t xml:space="preserve">. Think about it like a toolbox, or an app for your phone that you need to install for a specific function. Base R packages are downloaded at the same time as RStudio is installed, others you need to</w:t>
+        <w:t xml:space="preserve">. Think about it like a toolbox, or an app for your phone that you need to install for a specific function. Base R packages are downloaded at the same time as RStudio is installed; others you need to</w:t>
       </w:r>
       <w:r>
         <w:t xml:space="preserve"> </w:t>
@@ -1756,7 +1747,7 @@
         <w:pStyle w:val="FirstParagraph"/>
       </w:pPr>
       <w:r>
-        <w:t xml:space="preserve">For two reasons. Firstly, if every time you opened RStudio it would have to</w:t>
+        <w:t xml:space="preserve">For two reasons. Firstly, if every time you opened RStudio, it would have to</w:t>
       </w:r>
       <w:r>
         <w:t xml:space="preserve"> </w:t>
@@ -1780,7 +1771,7 @@
         <w:pStyle w:val="BodyText"/>
       </w:pPr>
       <w:r>
-        <w:t xml:space="preserve">Secondly, the R programming language is a collective non-profit project – thousands of scientists and programmers have contributed to it since it was created -</w:t>
+        <w:t xml:space="preserve">Secondly, the R programming language is a collective non-profit project – thousands of scientists and programmers have contributed to it since it was created.</w:t>
       </w:r>
       <w:r>
         <w:t xml:space="preserve"> </w:t>
@@ -1793,7 +1784,7 @@
         <w:t xml:space="preserve">You do not need all of these packages</w:t>
       </w:r>
       <w:r>
-        <w:t xml:space="preserve">. There are many hyper specific packages being introduced every year for very particular research and analysis purposes. This allows people to personalize their R experience and contribute to its development.</w:t>
+        <w:t xml:space="preserve">. Many hyper-specific packages are being introduced every year for very particular research and analysis purposes. This allows people to personalize their R experience and contribute to its development.</w:t>
       </w:r>
     </w:p>
     <w:bookmarkEnd w:id="31"/>
@@ -1819,7 +1810,7 @@
           <w:b/>
           <w:bCs/>
         </w:rPr>
-        <w:t xml:space="preserve">Browse the pre-existing packages in your RStudio. Then try googling or looking up packages for you specific purposes (e.g. by typing “R package for [your purpose]”).</w:t>
+        <w:t xml:space="preserve">Browse the pre-existing packages in your RStudio. Then try googling or looking up packages for your specific purposes (e.g., by typing “R package for [your purpose]”).</w:t>
       </w:r>
     </w:p>
     <w:p>
@@ -1924,7 +1915,7 @@
         <w:t xml:space="preserve"> </w:t>
       </w:r>
       <w:r>
-        <w:t xml:space="preserve">function. However, if the package is not installed you have to do it and then load with</w:t>
+        <w:t xml:space="preserve">function. However, if the package is not installed, you have to do it and then load it with the</w:t>
       </w:r>
       <w:r>
         <w:t xml:space="preserve"> </w:t>
@@ -1998,7 +1989,7 @@
           <w:b/>
           <w:bCs/>
         </w:rPr>
-        <w:t xml:space="preserve">Base R packages does not need to be loaded!</w:t>
+        <w:t xml:space="preserve">Base R packages do not need to be loaded!</w:t>
       </w:r>
     </w:p>
     <w:p>
@@ -2169,7 +2160,7 @@
           <w:i/>
           <w:iCs/>
         </w:rPr>
-        <w:t xml:space="preserve">Advice: the more packages you install, the longer it will take for RStudio to open; it can also slow down the app. For most computers this difference is pretty small, however, if you have an older laptop, it is better not to install every package under the sun.</w:t>
+        <w:t xml:space="preserve">Advice: The more packages you install, the longer it will take for RStudio to open; it can also slow down the app. For most computers, this difference is pretty small; however, if you have an older laptop, it is better not to install every package under the sun.</w:t>
       </w:r>
     </w:p>
     <w:bookmarkEnd w:id="36"/>
@@ -2197,7 +2188,7 @@
           <w:b/>
           <w:bCs/>
         </w:rPr>
-        <w:t xml:space="preserve">more universal, plain text files</w:t>
+        <w:t xml:space="preserve">more universal, plain-text files</w:t>
       </w:r>
       <w:r>
         <w:t xml:space="preserve"> </w:t>
@@ -2331,7 +2322,7 @@
           <w:i/>
           <w:iCs/>
         </w:rPr>
-        <w:t xml:space="preserve">For Polish speakers: Using Polish versions of some software (e.g. Excel) with default settings of the operating system may generate problems with .csv files as comma is used as decimal delimiter. Excel (in polish) by default creates .csv file with columns separated by semicolon (;). Then, arguments of importing R functions need to be properly adjusted.</w:t>
+        <w:t xml:space="preserve">For Polish speakers: Using Polish versions of some software (e.g., Excel) with default settings of the operating system may generate problems with .csv files, as the comma is used as the decimal delimiter. Excel (in Polish) by default creates a .csv file with columns separated by semicolon (;). Then, arguments of importing R functions need to be properly adjusted.</w:t>
       </w:r>
     </w:p>
     <w:bookmarkEnd w:id="37"/>
@@ -2429,7 +2420,7 @@
           <w:i/>
           <w:iCs/>
         </w:rPr>
-        <w:t xml:space="preserve">comma separated</w:t>
+        <w:t xml:space="preserve">comma-separated</w:t>
       </w:r>
       <w:r>
         <w:rPr>
@@ -2461,7 +2452,7 @@
           <w:b/>
           <w:bCs/>
         </w:rPr>
-        <w:t xml:space="preserve">does not require any additional package</w:t>
+        <w:t xml:space="preserve">does not require any additional packages</w:t>
       </w:r>
       <w:r>
         <w:t xml:space="preserve">. We can do it using a</w:t>
@@ -2584,7 +2575,7 @@
         <w:t xml:space="preserve">header</w:t>
       </w:r>
       <w:r>
-        <w:t xml:space="preserve">: specifies whether the top row should be considered the headers of each column; should set as</w:t>
+        <w:t xml:space="preserve">: specifies whether the top row should be considered the headers of each column; should be set as</w:t>
       </w:r>
       <w:r>
         <w:t xml:space="preserve"> </w:t>
@@ -2636,7 +2627,43 @@
         <w:t xml:space="preserve">sep</w:t>
       </w:r>
       <w:r>
-        <w:t xml:space="preserve">: stands for separator; specifies which symbol (“,”, “_”, or “ “) was used to separate values in the file; by default, .csv files should be comma ( , ) separated, but might be set to something else – you can check by opening the .csv file though a basic text editor</w:t>
+        <w:t xml:space="preserve">: stands for separator; specifies which symbol (</w:t>
+      </w:r>
+      <w:r>
+        <w:rPr>
+          <w:rStyle w:val="VerbatimChar"/>
+        </w:rPr>
+        <w:t xml:space="preserve">,</w:t>
+      </w:r>
+      <w:r>
+        <w:t xml:space="preserve">,</w:t>
+      </w:r>
+      <w:r>
+        <w:t xml:space="preserve"> </w:t>
+      </w:r>
+      <w:r>
+        <w:rPr>
+          <w:rStyle w:val="VerbatimChar"/>
+        </w:rPr>
+        <w:t xml:space="preserve">_</w:t>
+      </w:r>
+      <w:r>
+        <w:t xml:space="preserve">, or</w:t>
+      </w:r>
+      <w:r>
+        <w:t xml:space="preserve"> </w:t>
+      </w:r>
+      <w:r>
+        <w:t xml:space="preserve">) was used to separate values in the file; by default, .csv files should be comma (</w:t>
+      </w:r>
+      <w:r>
+        <w:rPr>
+          <w:rStyle w:val="VerbatimChar"/>
+        </w:rPr>
+        <w:t xml:space="preserve">,</w:t>
+      </w:r>
+      <w:r>
+        <w:t xml:space="preserve">) separated, but might be set to something else – you can check by opening the .csv file through a basic text editor</w:t>
       </w:r>
       <w:r>
         <w:br/>
@@ -2658,7 +2685,7 @@
         <w:t xml:space="preserve">encoding</w:t>
       </w:r>
       <w:r>
-        <w:t xml:space="preserve">: specifies which encoding is used in the .csv file; can be important if you are using files with non-latin characters, for example*, but isn’t always needed</w:t>
+        <w:t xml:space="preserve">: specifies which encoding is used in the .csv file; can be important if you are using files with non-Latin characters, for example*, but isn’t always needed</w:t>
       </w:r>
     </w:p>
     <w:p>
@@ -2676,7 +2703,7 @@
           <w:b/>
           <w:bCs/>
         </w:rPr>
-        <w:t xml:space="preserve">non-latin characters</w:t>
+        <w:t xml:space="preserve">non-Latin characters</w:t>
       </w:r>
       <w:r>
         <w:t xml:space="preserve"> </w:t>
@@ -2721,7 +2748,7 @@
         <w:t xml:space="preserve"> </w:t>
       </w:r>
       <w:r>
-        <w:t xml:space="preserve">function can work with just one argument – the file name. However, as the name suggests, it only works with standard .csv file and does not allow for certain kinds of customization through arguments.</w:t>
+        <w:t xml:space="preserve">function can work with just one argument – the file name. However, as the name suggests, it only works with standard .csv files and does not allow for certain kinds of customization through arguments.</w:t>
       </w:r>
     </w:p>
     <w:bookmarkEnd w:id="38"/>
@@ -2805,7 +2832,7 @@
           <w:b/>
           <w:bCs/>
         </w:rPr>
-        <w:t xml:space="preserve">function manuals. Upload</w:t>
+        <w:t xml:space="preserve">function manuals. Upload the</w:t>
       </w:r>
       <w:r>
         <w:rPr>
@@ -2963,7 +2990,7 @@
           <w:b/>
           <w:bCs/>
         </w:rPr>
-        <w:t xml:space="preserve">improve your google searches</w:t>
+        <w:t xml:space="preserve">improve your Google searches</w:t>
       </w:r>
       <w:r>
         <w:t xml:space="preserve"> </w:t>
@@ -3001,7 +3028,7 @@
         <w:t xml:space="preserve"> </w:t>
       </w:r>
       <w:r>
-        <w:t xml:space="preserve">and Boolean logic (e.g. “R package” AND “general linear model”)</w:t>
+        <w:t xml:space="preserve">and Boolean logic (e.g., “R package” AND “general linear model”)</w:t>
       </w:r>
       <w:r>
         <w:br/>
@@ -3326,7 +3353,7 @@
         <w:t xml:space="preserve"> </w:t>
       </w:r>
       <w:r>
-        <w:t xml:space="preserve">– keep in mind that multiple packages can use the same word to describe different functions, so make sure to read its description before downloading the package</w:t>
+        <w:t xml:space="preserve">– keep in mind that multiple packages can use the same word to describe different functions, so make sure to read their descriptions before downloading the package</w:t>
       </w:r>
     </w:p>
     <w:bookmarkEnd w:id="44"/>
@@ -3371,7 +3398,7 @@
         <w:pStyle w:val="FirstParagraph"/>
       </w:pPr>
       <w:r>
-        <w:t xml:space="preserve">It is likely that you will encounter</w:t>
+        <w:t xml:space="preserve">You will likely encounter</w:t>
       </w:r>
       <w:r>
         <w:t xml:space="preserve"> </w:t>
@@ -3403,7 +3430,7 @@
         <w:t xml:space="preserve"> </w:t>
       </w:r>
       <w:r>
-        <w:t xml:space="preserve">on a daily basis while using R. This does not mean you are careless or bad at coding – errors and warnings exist to</w:t>
+        <w:t xml:space="preserve">daily while using R. This does not mean you are careless or bad at coding – errors and warnings exist to</w:t>
       </w:r>
       <w:r>
         <w:t xml:space="preserve"> </w:t>
@@ -3416,7 +3443,7 @@
         <w:t xml:space="preserve">guide you in the process of using R</w:t>
       </w:r>
       <w:r>
-        <w:t xml:space="preserve">. Because computers are very particular about details and can be unintuitive for us, it takes effort to understand them. Knowing how to react to errors is a big component of effective coding workflow.</w:t>
+        <w:t xml:space="preserve">. Because computers are very particular about details and can be unintuitive for us, it takes effort to understand them. Knowing how to react to errors is a big component of an effective coding workflow.</w:t>
       </w:r>
     </w:p>
     <w:p>
@@ -3424,7 +3451,7 @@
         <w:pStyle w:val="BodyText"/>
       </w:pPr>
       <w:r>
-        <w:t xml:space="preserve">Whenever RStudio finds an issue in the code, it will display a message in the console. When in doubt, you can always copy the message and paste it into google search.</w:t>
+        <w:t xml:space="preserve">Whenever RStudio finds an issue in the code, it will display a message in the console. When in doubt, you can always copy the message and paste it into Google search.</w:t>
       </w:r>
     </w:p>
     <w:bookmarkEnd w:id="47"/>
@@ -3508,7 +3535,7 @@
         <w:t xml:space="preserve">converting between data types</w:t>
       </w:r>
       <w:r>
-        <w:t xml:space="preserve">, e.g. numeric to character; if R fails to do this for whatever reason, it will insert an</w:t>
+        <w:t xml:space="preserve">, e.g., numeric to character; if R fails to do this for whatever reason, it will insert an</w:t>
       </w:r>
       <w:r>
         <w:t xml:space="preserve"> </w:t>
@@ -3607,7 +3634,7 @@
         <w:pStyle w:val="FirstParagraph"/>
       </w:pPr>
       <w:r>
-        <w:t xml:space="preserve">Some warning messages can be safely ignored, while some indicate potential issues in your code. When in doubt, always double check on the internet.</w:t>
+        <w:t xml:space="preserve">Some warning messages can be safely ignored, while some indicate potential issues in your code. When in doubt, always double-check on the internet.</w:t>
       </w:r>
     </w:p>
     <w:bookmarkStart w:id="48" w:name="exercise-11"/>
@@ -3770,7 +3797,7 @@
         <w:t xml:space="preserve"> </w:t>
       </w:r>
       <w:r>
-        <w:t xml:space="preserve">until it will stop working.</w:t>
+        <w:t xml:space="preserve">until it stops working.</w:t>
       </w:r>
     </w:p>
     <w:p>
@@ -3808,7 +3835,7 @@
         <w:t xml:space="preserve"> </w:t>
       </w:r>
       <w:r>
-        <w:t xml:space="preserve">- you are trying to perform an operation on an</w:t>
+        <w:t xml:space="preserve">- you are trying to operate on an</w:t>
       </w:r>
       <w:r>
         <w:t xml:space="preserve"> </w:t>
@@ -3890,7 +3917,7 @@
         <w:t xml:space="preserve">syntax issue</w:t>
       </w:r>
       <w:r>
-        <w:t xml:space="preserve">, e.g. a typo in the function, a misplaced comma, or missing parentheses</w:t>
+        <w:t xml:space="preserve">, e.g., a typo in the function, a misplaced comma, or missing parentheses</w:t>
       </w:r>
       <w:r>
         <w:br/>
@@ -4052,7 +4079,7 @@
         <w:pStyle w:val="FirstParagraph"/>
       </w:pPr>
       <w:r>
-        <w:t xml:space="preserve">If all of the above fails, you can try looking up your specific situation – chances are, someone else had the exact same issue and posted it on</w:t>
+        <w:t xml:space="preserve">If all of the above fails, you can try looking up your specific situation – chances are, someone else had the same issue and posted it on</w:t>
       </w:r>
       <w:r>
         <w:t xml:space="preserve"> </w:t>
@@ -4081,10 +4108,7 @@
         <w:t xml:space="preserve">StackOverflow</w:t>
       </w:r>
       <w:r>
-        <w:t xml:space="preserve"> </w:t>
-      </w:r>
-      <w:r>
-        <w:t xml:space="preserve">where someone else has already explained how to fix it.</w:t>
+        <w:t xml:space="preserve">. where someone else has already explained how to fix it.</w:t>
       </w:r>
     </w:p>
     <w:bookmarkEnd w:id="48"/>
@@ -4265,7 +4289,7 @@
         <w:t xml:space="preserve"> </w:t>
       </w:r>
       <w:r>
-        <w:t xml:space="preserve">to keep previous versions in hand in case you will need to revert the changes</w:t>
+        <w:t xml:space="preserve">to keep previous versions in hand in case you need to revert the changes</w:t>
       </w:r>
     </w:p>
     <w:p>
@@ -4333,7 +4357,7 @@
         <w:t xml:space="preserve"> </w:t>
       </w:r>
       <w:r>
-        <w:t xml:space="preserve">- the shorter the script, the less can go wrong</w:t>
+        <w:t xml:space="preserve">- the shorter the script, the less that can go wrong</w:t>
       </w:r>
       <w:r>
         <w:br/>
@@ -4394,7 +4418,7 @@
         <w:t xml:space="preserve"> </w:t>
       </w:r>
       <w:r>
-        <w:t xml:space="preserve">to make your files more tidy – we will learn more about it during the next lesson</w:t>
+        <w:t xml:space="preserve">to make your files tidier – we will learn more about it during the next lesson</w:t>
       </w:r>
     </w:p>
     <w:bookmarkEnd w:id="51"/>
@@ -4452,7 +4476,7 @@
         <w:t xml:space="preserve"> </w:t>
       </w:r>
       <w:r>
-        <w:t xml:space="preserve">file into the RStudio using your preferred method.</w:t>
+        <w:t xml:space="preserve">file into RStudio using your preferred method.</w:t>
       </w:r>
       <w:r>
         <w:t xml:space="preserve"> </w:t>
@@ -4536,7 +4560,7 @@
         <w:t xml:space="preserve"> </w:t>
       </w:r>
       <w:r>
-        <w:t xml:space="preserve">of a data frame. Use it to sort homework data frame according to the values in the column</w:t>
+        <w:t xml:space="preserve">of a data frame. Use it to sort the homework data frame according to the values in the column</w:t>
       </w:r>
       <w:r>
         <w:t xml:space="preserve"> </w:t>
@@ -4572,7 +4596,7 @@
         <w:t xml:space="preserve"> </w:t>
       </w:r>
       <w:r>
-        <w:t xml:space="preserve">function. Call the .csv file “class_2_sorted_column_Your_Name.csv”. Check</w:t>
+        <w:t xml:space="preserve">function. Call the .csv file “class_2_sorted_column_Your_Name.csv”. Check the</w:t>
       </w:r>
       <w:r>
         <w:t xml:space="preserve"> </w:t>
@@ -4587,7 +4611,7 @@
         <w:t xml:space="preserve"> </w:t>
       </w:r>
       <w:r>
-        <w:t xml:space="preserve">function manual to find out what arguments you should use to save .csv file properly. The file should have column names and fields should be separated by commas</w:t>
+        <w:t xml:space="preserve">function manual to find out what arguments you should use to save a .csv file properly. The file should have column names and fields should be separated by commas</w:t>
       </w:r>
       <w:r>
         <w:t xml:space="preserve"> </w:t>
@@ -4639,7 +4663,7 @@
           <w:b/>
           <w:bCs/>
         </w:rPr>
-        <w:t xml:space="preserve">tab on</w:t>
+        <w:t xml:space="preserve">tab on the</w:t>
       </w:r>
       <w:r>
         <w:rPr>

</xml_diff>